<commit_message>
Se realiza ajustes de titulos e ingresos de base
</commit_message>
<xml_diff>
--- a/output_abogados/Ana_Maria_Guzman_Acosta/WORDS/aviso/OFICIO_54346_PRODECA_S.A.docx
+++ b/output_abogados/Ana_Maria_Guzman_Acosta/WORDS/aviso/OFICIO_54346_PRODECA_S.A.docx
@@ -383,8 +383,6 @@
           <w:szCs w:val="24"/>
         </w:rPr>
       </w:pPr>
-      <w:proofErr w:type="gramStart"/>
-      <w:proofErr w:type="gramEnd"/>
       <w:r>
         <w:rPr>
           <w:rFonts w:ascii="Arial" w:hAnsi="Arial"/>
@@ -413,8 +411,6 @@
           <w:szCs w:val="24"/>
         </w:rPr>
       </w:pPr>
-      <w:proofErr w:type="gramStart"/>
-      <w:proofErr w:type="gramEnd"/>
       <w:r>
         <w:rPr>
           <w:rFonts w:ascii="Arial" w:hAnsi="Arial"/>

</xml_diff>